<commit_message>
Add bhavcopy-pipeline to the resume and rebuild it from the script
</commit_message>
<xml_diff>
--- a/Veer_Arora_Resume.docx
+++ b/Veer_Arora_Resume.docx
@@ -215,7 +215,7 @@
           <w:color w:val="1A1A1A"/>
           <w:sz w:val="17"/>
         </w:rPr>
-        <w:t>Python, SQL, Pandas, NumPy, data cleaning and validation, EDA</w:t>
+        <w:t>Python, SQL, DuckDB, dbt, Pandas, NumPy, data cleaning and validation, EDA</w:t>
       </w:r>
     </w:p>
     <w:p>
@@ -667,6 +667,30 @@
           <w:color w:val="1A1A1A"/>
           <w:sz w:val="17"/>
         </w:rPr>
+        <w:t>Verified against a real bank export, not only fixtures: 225 transactions across three months reconcile to the paisa, and against the closing balance the bank prints in its own summary block. First contact with real data surfaced four defects no synthetic fixture could have found, including amounts masked with asterisks and an IFSC code read as a reference number. Each is now a test.</w:t>
+      </w:r>
+    </w:p>
+    <w:p>
+      <w:pPr>
+        <w:spacing w:before="0" w:after="30"/>
+        <w:ind w:left="245" w:hanging="158"/>
+      </w:pPr>
+      <w:r>
+        <w:rPr>
+          <w:b w:val="0"/>
+          <w:i w:val="0"/>
+          <w:color w:val="8A6D1A"/>
+          <w:sz w:val="17"/>
+        </w:rPr>
+        <w:t xml:space="preserve">•  </w:t>
+      </w:r>
+      <w:r>
+        <w:rPr>
+          <w:b w:val="0"/>
+          <w:i w:val="0"/>
+          <w:color w:val="1A1A1A"/>
+          <w:sz w:val="17"/>
+        </w:rPr>
         <w:t>499 tests, CI green on Python 3.11 and 3.12. Also shipped as a paid n8n template: extraction is deterministic, the model only assigns column roles behind a structured-output schema, and arithmetic checks the result. In a live run the model mislabelled a salary row and the row-by-row walk caught it, while an opening-versus-closing check alone would have passed it.</w:t>
       </w:r>
     </w:p>
@@ -785,7 +809,31 @@
           <w:color w:val="1A1A1A"/>
           <w:sz w:val="17"/>
         </w:rPr>
-        <w:t>Wrote a scenario-based evaluation harness scoring six dimensions (tool-selection precision, recall and F1, task-success, escalation accuracy, citation-grounding, cost, latency) and persisted every run for before-and-after tracking. FastAPI, SQLAlchemy and Alembic on SQLite in development and Postgres in production; 33 automated tests.</w:t>
+        <w:t>Wrote a scenario-based evaluation harness scoring six dimensions (tool-selection precision, recall and F1, task-success, escalation accuracy, citation-grounding, cost, latency) and persisted every run for before-and-after tracking. FastAPI, SQLAlchemy and Alembic on SQLite in development and Postgres in production; 36 automated tests.</w:t>
+      </w:r>
+    </w:p>
+    <w:p>
+      <w:pPr>
+        <w:spacing w:before="0" w:after="30"/>
+        <w:ind w:left="245" w:hanging="158"/>
+      </w:pPr>
+      <w:r>
+        <w:rPr>
+          <w:b w:val="0"/>
+          <w:i w:val="0"/>
+          <w:color w:val="8A6D1A"/>
+          <w:sz w:val="17"/>
+        </w:rPr>
+        <w:t xml:space="preserve">•  </w:t>
+      </w:r>
+      <w:r>
+        <w:rPr>
+          <w:b w:val="0"/>
+          <w:i w:val="0"/>
+          <w:color w:val="1A1A1A"/>
+          <w:sz w:val="17"/>
+        </w:rPr>
+        <w:t>Ran the suite eight times against a live model rather than once. Tool-selection F1 rose from a 0.60 baseline to 0.78 on the mean, and citation-grounding held at 1.000 with zero deviation across 80 scenario-runs. Run-to-run spread was 0.11, wider than the effect being measured, so the writeup reports a mean and a spread rather than whichever single pass looked best.</w:t>
       </w:r>
     </w:p>
     <w:p>
@@ -917,6 +965,118 @@
           <w:color w:val="1A1A1A"/>
           <w:sz w:val="18"/>
         </w:rPr>
+        <w:t>bhavcopy-pipeline: a daily market-data pipeline</w:t>
+      </w:r>
+      <w:r>
+        <w:rPr>
+          <w:b w:val="0"/>
+          <w:i w:val="0"/>
+          <w:color w:val="444444"/>
+          <w:sz w:val="16"/>
+        </w:rPr>
+        <w:t xml:space="preserve">    </w:t>
+      </w:r>
+      <w:hyperlink r:id="rId15">
+        <w:r>
+          <w:rPr>
+            <w:color w:val="8a6d1a"/>
+            <w:sz w:val="17"/>
+          </w:rPr>
+          <w:t xml:space="preserve">github.com/veer0608/bhavcopy-pipeline</w:t>
+        </w:r>
+      </w:hyperlink>
+    </w:p>
+    <w:p>
+      <w:pPr>
+        <w:spacing w:before="0" w:after="30"/>
+      </w:pPr>
+      <w:r>
+        <w:rPr>
+          <w:b w:val="0"/>
+          <w:i/>
+          <w:color w:val="444444"/>
+          <w:sz w:val="16"/>
+        </w:rPr>
+        <w:t>Python · DuckDB · dbt · pytest · GitHub Actions</w:t>
+      </w:r>
+    </w:p>
+    <w:p>
+      <w:pPr>
+        <w:spacing w:before="0" w:after="30"/>
+        <w:ind w:left="245" w:hanging="158"/>
+      </w:pPr>
+      <w:r>
+        <w:rPr>
+          <w:b w:val="0"/>
+          <w:i w:val="0"/>
+          <w:color w:val="8A6D1A"/>
+          <w:sz w:val="17"/>
+        </w:rPr>
+        <w:t xml:space="preserve">•  </w:t>
+      </w:r>
+      <w:r>
+        <w:rPr>
+          <w:b w:val="0"/>
+          <w:i w:val="0"/>
+          <w:color w:val="1A1A1A"/>
+          <w:sz w:val="17"/>
+        </w:rPr>
+        <w:t>Built a daily pipeline for NSE and BSE end-of-day prices with no model in it: each file is landed as an immutable gzip, loaded into DuckDB, then modelled and tested with dbt, on a GitHub Actions schedule. 563,111 rows across 66 trading days per exchange.</w:t>
+      </w:r>
+    </w:p>
+    <w:p>
+      <w:pPr>
+        <w:spacing w:before="0" w:after="30"/>
+        <w:ind w:left="245" w:hanging="158"/>
+      </w:pPr>
+      <w:r>
+        <w:rPr>
+          <w:b w:val="0"/>
+          <w:i w:val="0"/>
+          <w:color w:val="8A6D1A"/>
+          <w:sz w:val="17"/>
+        </w:rPr>
+        <w:t xml:space="preserve">•  </w:t>
+      </w:r>
+      <w:r>
+        <w:rPr>
+          <w:b w:val="0"/>
+          <w:i w:val="0"/>
+          <w:color w:val="1A1A1A"/>
+          <w:sz w:val="17"/>
+        </w:rPr>
+        <w:t xml:space="preserve">Made the load </w:t>
+      </w:r>
+      <w:r>
+        <w:rPr>
+          <w:b/>
+          <w:i w:val="0"/>
+          <w:color w:val="1A1A1A"/>
+          <w:sz w:val="17"/>
+        </w:rPr>
+        <w:t>idempotent and restatable</w:t>
+      </w:r>
+      <w:r>
+        <w:rPr>
+          <w:b w:val="0"/>
+          <w:i w:val="0"/>
+          <w:color w:val="1A1A1A"/>
+          <w:sz w:val="17"/>
+        </w:rPr>
+        <w:t>, and tested both: re-running a day changes nothing, an incremental build equals a full refresh, and a republished file replaces its day whole. 18 dbt data tests.</w:t>
+      </w:r>
+    </w:p>
+    <w:p>
+      <w:pPr>
+        <w:spacing w:before="80" w:after="10"/>
+      </w:pPr>
+      <w:r>
+        <w:rPr>
+          <w:b/>
+          <w:i w:val="0"/>
+          <w:color w:val="1A1A1A"/>
+          <w:sz w:val="18"/>
+        </w:rPr>
         <w:t>schemablind: a schema-blind SQL agent</w:t>
       </w:r>
       <w:r>
@@ -928,7 +1088,7 @@
         </w:rPr>
         <w:t xml:space="preserve">    </w:t>
       </w:r>
-      <w:hyperlink r:id="rId15">
+      <w:hyperlink r:id="rId16">
         <w:r>
           <w:rPr>
             <w:color w:val="8a6d1a"/>
@@ -1046,7 +1206,7 @@
         </w:rPr>
         <w:t xml:space="preserve">    </w:t>
       </w:r>
-      <w:hyperlink r:id="rId16">
+      <w:hyperlink r:id="rId17">
         <w:r>
           <w:rPr>
             <w:color w:val="8a6d1a"/>
@@ -1091,7 +1251,7 @@
           <w:color w:val="1A1A1A"/>
           <w:sz w:val="17"/>
         </w:rPr>
-        <w:t>Caption and cut timings come from the speech engine's own word-boundary events, never from transcribing the audio it had just produced. The usual pipeline synthesises speech and then runs Whisper over it to find the words again; removing that step removes a model download, a dependency, and every source of drift. Shots cut on the sentence boundaries those same events report, so the picture changes where the speaker lands a full stop rather than on a timer.</w:t>
+        <w:t>Built a pipeline that turns a markdown script into a delivery-ready mp4: neural narration, a shot per scene, burned-in word-timed captions, music ducked under the voice, plus an .srt file and a draft title, description and chapters.</w:t>
       </w:r>
     </w:p>
     <w:p>
@@ -1115,7 +1275,7 @@
           <w:color w:val="1A1A1A"/>
           <w:sz w:val="17"/>
         </w:rPr>
-        <w:t>Stock search ranks by popularity rather than by what is in frame, so candidate clips are re-ranked by a vision model against the narration line and anything marked as the wrong subject is never used. Attribution is treated as a correctness property rather than a courtesy: a pre-publish check reads the delivered files against each other, comparing the credit in the credits file against the one in the published description and each thumbnail's orientation against the cut it names. It was written after those silently diverged across four finished videos. 411 tests including real encodes, on ubuntu, windows and macos.</w:t>
+        <w:t>Caption and cut timings come from the TTS engine's own word-boundary events rather than from transcribing the audio it had just produced, so there is no Whisper dependency and nothing to drift. Shots cut on the sentence boundaries those same events report, and candidate stock clips are re-ranked by a vision model against the narration line, because stock search ranks by popularity rather than by what is in frame.</w:t>
       </w:r>
     </w:p>
     <w:p>
@@ -1140,7 +1300,7 @@
         </w:rPr>
         <w:t xml:space="preserve">    </w:t>
       </w:r>
-      <w:hyperlink r:id="rId17">
+      <w:hyperlink r:id="rId18">
         <w:r>
           <w:rPr>
             <w:color w:val="8a6d1a"/>
@@ -1287,7 +1447,7 @@
       <w:pPr>
         <w:spacing w:before="0" w:after="40"/>
       </w:pPr>
-      <w:hyperlink r:id="rId18">
+      <w:hyperlink r:id="rId19">
         <w:r>
           <w:rPr>
             <w:color w:val="8a6d1a"/>
@@ -1315,7 +1475,7 @@
         </w:rPr>
         <w:t xml:space="preserve">   ·   </w:t>
       </w:r>
-      <w:hyperlink r:id="rId19">
+      <w:hyperlink r:id="rId20">
         <w:r>
           <w:rPr>
             <w:color w:val="8a6d1a"/>
@@ -1343,7 +1503,7 @@
         </w:rPr>
         <w:t xml:space="preserve">   ·   </w:t>
       </w:r>
-      <w:hyperlink r:id="rId20">
+      <w:hyperlink r:id="rId21">
         <w:r>
           <w:rPr>
             <w:color w:val="8a6d1a"/>
@@ -1371,7 +1531,7 @@
         </w:rPr>
         <w:t xml:space="preserve">   ·   </w:t>
       </w:r>
-      <w:hyperlink r:id="rId21">
+      <w:hyperlink r:id="rId22">
         <w:r>
           <w:rPr>
             <w:color w:val="8a6d1a"/>

</xml_diff>

<commit_message>
Add syncline: card, project count, resume
</commit_message>
<xml_diff>
--- a/Veer_Arora_Resume.docx
+++ b/Veer_Arora_Resume.docx
@@ -129,7 +129,61 @@
           <w:color w:val="1A1A1A"/>
           <w:sz w:val="17"/>
         </w:rPr>
-        <w:t>Backend and AI engineer building systems that check their own output: reconciliation gates that test a parse against the source's own arithmetic, policy gates on agent actions, retrieval that cites the passage it used, and evaluation harnesses with held-out splits. At L&amp;T Finance, validated Nostradamus, an 8-model MLOps platform on GCP and Kubeflow, ahead of its production release. Recent projects include a bank-statement ledger that proves it balances to the paisa before it categorises anything, an LLM support agent whose every write passes a policy and escalation gate, and a RAG system whose recall@5 rose from 0.37 to 0.77 against a measured ceiling of 0.85. B.Tech Computer Science &amp; Design, 2026.</w:t>
+        <w:t>Data and backend engineer, B.Tech Computer Science &amp; Design (2026), who builds systems that check their own output. Built a daily NSE and BSE price pipeline on DuckDB, dbt and GitHub Actions whose loads are idempotent and restatable, an API connector that resumes safely after a crash, a bank-statement ledger that proves it balances to the paisa before it categorises anything, and a RAG system whose recall@5 rose from 0.37 to 0.77 against a measured ceiling of 0.85. At L&amp;T Finance, validated Nostradamus, an 8-model MLOps platform on GCP and Kubeflow, ahead of its production release.</w:t>
+      </w:r>
+    </w:p>
+    <w:p>
+      <w:pPr>
+        <w:spacing w:before="140" w:after="60"/>
+        <w:pBdr>
+          <w:bottom w:val="single" w:sz="6" w:space="1" w:color="8a6d1a"/>
+        </w:pBdr>
+      </w:pPr>
+      <w:r>
+        <w:rPr>
+          <w:b/>
+          <w:i w:val="0"/>
+          <w:color w:val="8A6D1A"/>
+          <w:sz w:val="20"/>
+        </w:rPr>
+        <w:t>EDUCATION</w:t>
+      </w:r>
+    </w:p>
+    <w:p>
+      <w:pPr>
+        <w:spacing w:before="0" w:after="30"/>
+      </w:pPr>
+      <w:r>
+        <w:rPr>
+          <w:b/>
+          <w:i w:val="0"/>
+          <w:color w:val="1A1A1A"/>
+          <w:sz w:val="17"/>
+        </w:rPr>
+        <w:t>Madhav Institute of Technology &amp; Science, Gwalior</w:t>
+      </w:r>
+      <w:r>
+        <w:rPr>
+          <w:b w:val="0"/>
+          <w:i w:val="0"/>
+          <w:color w:val="1A1A1A"/>
+          <w:sz w:val="17"/>
+        </w:rPr>
+        <w:t>, B.Tech, Computer Science &amp; Design, 2022 – 2026</w:t>
+      </w:r>
+    </w:p>
+    <w:p>
+      <w:pPr>
+        <w:spacing w:before="0" w:after="40"/>
+      </w:pPr>
+      <w:r>
+        <w:rPr>
+          <w:b w:val="0"/>
+          <w:i w:val="0"/>
+          <w:color w:val="444444"/>
+          <w:sz w:val="16"/>
+        </w:rPr>
+        <w:t>Shanti Niketan HS School, Vidisha, Class 12 (2021)   •   Trinity Convent Sr. Sec. School, Vidisha, Class 10 (2019)</w:t>
       </w:r>
     </w:p>
     <w:p>
@@ -147,6 +201,29 @@
           <w:sz w:val="20"/>
         </w:rPr>
         <w:t>SKILLS</w:t>
+      </w:r>
+    </w:p>
+    <w:p>
+      <w:pPr>
+        <w:spacing w:before="0" w:after="30"/>
+      </w:pPr>
+      <w:r>
+        <w:rPr>
+          <w:b/>
+          <w:i w:val="0"/>
+          <w:color w:val="1A1A1A"/>
+          <w:sz w:val="17"/>
+        </w:rPr>
+        <w:t xml:space="preserve">Languages &amp; Data   </w:t>
+      </w:r>
+      <w:r>
+        <w:rPr>
+          <w:b w:val="0"/>
+          <w:i w:val="0"/>
+          <w:color w:val="1A1A1A"/>
+          <w:sz w:val="17"/>
+        </w:rPr>
+        <w:t>Python, SQL, DuckDB, dbt, Dagster, Pandas, NumPy, data cleaning and validation, EDA</w:t>
       </w:r>
     </w:p>
     <w:p>
@@ -193,29 +270,6 @@
           <w:sz w:val="17"/>
         </w:rPr>
         <w:t>FastAPI, PostgreSQL, row-level security, SQLAlchemy, Alembic, REST APIs, GitHub Actions CI, pytest, Docker, Git, React, TypeScript</w:t>
-      </w:r>
-    </w:p>
-    <w:p>
-      <w:pPr>
-        <w:spacing w:before="0" w:after="30"/>
-      </w:pPr>
-      <w:r>
-        <w:rPr>
-          <w:b/>
-          <w:i w:val="0"/>
-          <w:color w:val="1A1A1A"/>
-          <w:sz w:val="17"/>
-        </w:rPr>
-        <w:t xml:space="preserve">Languages &amp; Data   </w:t>
-      </w:r>
-      <w:r>
-        <w:rPr>
-          <w:b w:val="0"/>
-          <w:i w:val="0"/>
-          <w:color w:val="1A1A1A"/>
-          <w:sz w:val="17"/>
-        </w:rPr>
-        <w:t>Python, SQL, DuckDB, dbt, Pandas, NumPy, data cleaning and validation, EDA</w:t>
       </w:r>
     </w:p>
     <w:p>
@@ -521,6 +575,266 @@
           <w:color w:val="1A1A1A"/>
           <w:sz w:val="18"/>
         </w:rPr>
+        <w:t>bhavcopy-pipeline: a daily market-data pipeline</w:t>
+      </w:r>
+      <w:r>
+        <w:rPr>
+          <w:b w:val="0"/>
+          <w:i w:val="0"/>
+          <w:color w:val="444444"/>
+          <w:sz w:val="16"/>
+        </w:rPr>
+        <w:t xml:space="preserve">    </w:t>
+      </w:r>
+      <w:hyperlink r:id="rId12">
+        <w:r>
+          <w:rPr>
+            <w:color w:val="8a6d1a"/>
+            <w:sz w:val="17"/>
+          </w:rPr>
+          <w:t xml:space="preserve">github.com/veer0608/bhavcopy-pipeline</w:t>
+        </w:r>
+      </w:hyperlink>
+    </w:p>
+    <w:p>
+      <w:pPr>
+        <w:spacing w:before="0" w:after="30"/>
+      </w:pPr>
+      <w:r>
+        <w:rPr>
+          <w:b w:val="0"/>
+          <w:i/>
+          <w:color w:val="444444"/>
+          <w:sz w:val="16"/>
+        </w:rPr>
+        <w:t>Python · DuckDB · dbt · pytest · GitHub Actions</w:t>
+      </w:r>
+    </w:p>
+    <w:p>
+      <w:pPr>
+        <w:spacing w:before="0" w:after="30"/>
+        <w:ind w:left="245" w:hanging="158"/>
+      </w:pPr>
+      <w:r>
+        <w:rPr>
+          <w:b w:val="0"/>
+          <w:i w:val="0"/>
+          <w:color w:val="8A6D1A"/>
+          <w:sz w:val="17"/>
+        </w:rPr>
+        <w:t xml:space="preserve">•  </w:t>
+      </w:r>
+      <w:r>
+        <w:rPr>
+          <w:b w:val="0"/>
+          <w:i w:val="0"/>
+          <w:color w:val="1A1A1A"/>
+          <w:sz w:val="17"/>
+        </w:rPr>
+        <w:t>Built a daily pipeline for NSE and BSE end-of-day prices with no model in it: each file is landed as an immutable gzip, loaded into DuckDB, then modelled and tested with dbt, on a GitHub Actions schedule. 563,111 rows across 66 trading days per exchange.</w:t>
+      </w:r>
+    </w:p>
+    <w:p>
+      <w:pPr>
+        <w:spacing w:before="0" w:after="30"/>
+        <w:ind w:left="245" w:hanging="158"/>
+      </w:pPr>
+      <w:r>
+        <w:rPr>
+          <w:b w:val="0"/>
+          <w:i w:val="0"/>
+          <w:color w:val="8A6D1A"/>
+          <w:sz w:val="17"/>
+        </w:rPr>
+        <w:t xml:space="preserve">•  </w:t>
+      </w:r>
+      <w:r>
+        <w:rPr>
+          <w:b w:val="0"/>
+          <w:i w:val="0"/>
+          <w:color w:val="1A1A1A"/>
+          <w:sz w:val="17"/>
+        </w:rPr>
+        <w:t xml:space="preserve">Made the load </w:t>
+      </w:r>
+      <w:r>
+        <w:rPr>
+          <w:b/>
+          <w:i w:val="0"/>
+          <w:color w:val="1A1A1A"/>
+          <w:sz w:val="17"/>
+        </w:rPr>
+        <w:t>idempotent and restatable</w:t>
+      </w:r>
+      <w:r>
+        <w:rPr>
+          <w:b w:val="0"/>
+          <w:i w:val="0"/>
+          <w:color w:val="1A1A1A"/>
+          <w:sz w:val="17"/>
+        </w:rPr>
+        <w:t>, and tested both: re-running a day changes nothing, an incremental build equals a full refresh, and a republished file replaces its day whole. 18 dbt data tests.</w:t>
+      </w:r>
+    </w:p>
+    <w:p>
+      <w:pPr>
+        <w:spacing w:before="80" w:after="10"/>
+      </w:pPr>
+      <w:r>
+        <w:rPr>
+          <w:b/>
+          <w:i w:val="0"/>
+          <w:color w:val="1A1A1A"/>
+          <w:sz w:val="18"/>
+        </w:rPr>
+        <w:t>syncline: an incremental API connector</w:t>
+      </w:r>
+      <w:r>
+        <w:rPr>
+          <w:b w:val="0"/>
+          <w:i w:val="0"/>
+          <w:color w:val="444444"/>
+          <w:sz w:val="16"/>
+        </w:rPr>
+        <w:t xml:space="preserve">    </w:t>
+      </w:r>
+      <w:hyperlink r:id="rId13">
+        <w:r>
+          <w:rPr>
+            <w:color w:val="8a6d1a"/>
+            <w:sz w:val="17"/>
+          </w:rPr>
+          <w:t xml:space="preserve">github.com/veer0608/syncline</w:t>
+        </w:r>
+      </w:hyperlink>
+    </w:p>
+    <w:p>
+      <w:pPr>
+        <w:spacing w:before="0" w:after="30"/>
+      </w:pPr>
+      <w:r>
+        <w:rPr>
+          <w:b w:val="0"/>
+          <w:i/>
+          <w:color w:val="444444"/>
+          <w:sz w:val="16"/>
+        </w:rPr>
+        <w:t>Python · DuckDB · Dagster · REST APIs · pytest</w:t>
+      </w:r>
+    </w:p>
+    <w:p>
+      <w:pPr>
+        <w:spacing w:before="0" w:after="30"/>
+        <w:ind w:left="245" w:hanging="158"/>
+      </w:pPr>
+      <w:r>
+        <w:rPr>
+          <w:b w:val="0"/>
+          <w:i w:val="0"/>
+          <w:color w:val="8A6D1A"/>
+          <w:sz w:val="17"/>
+        </w:rPr>
+        <w:t xml:space="preserve">•  </w:t>
+      </w:r>
+      <w:r>
+        <w:rPr>
+          <w:b w:val="0"/>
+          <w:i w:val="0"/>
+          <w:color w:val="1A1A1A"/>
+          <w:sz w:val="17"/>
+        </w:rPr>
+        <w:t xml:space="preserve">Built a connector that syncs GitHub issues and pull requests into DuckDB incrementally. Each page and its checkpoint commit in </w:t>
+      </w:r>
+      <w:r>
+        <w:rPr>
+          <w:b/>
+          <w:i w:val="0"/>
+          <w:color w:val="1A1A1A"/>
+          <w:sz w:val="17"/>
+        </w:rPr>
+        <w:t>one transaction</w:t>
+      </w:r>
+      <w:r>
+        <w:rPr>
+          <w:b w:val="0"/>
+          <w:i w:val="0"/>
+          <w:color w:val="1A1A1A"/>
+          <w:sz w:val="17"/>
+        </w:rPr>
+        <w:t>, so a run killed anywhere resumes with nothing lost or doubled. Rate limits are waited out, server errors back off with jitter, and new fields are recorded rather than fatal. Scheduled as a Dagster asset; 18 offline tests against a fault-injecting fake API.</w:t>
+      </w:r>
+    </w:p>
+    <w:p>
+      <w:pPr>
+        <w:spacing w:before="0" w:after="30"/>
+        <w:ind w:left="245" w:hanging="158"/>
+      </w:pPr>
+      <w:r>
+        <w:rPr>
+          <w:b w:val="0"/>
+          <w:i w:val="0"/>
+          <w:color w:val="8A6D1A"/>
+          <w:sz w:val="17"/>
+        </w:rPr>
+        <w:t xml:space="preserve">•  </w:t>
+      </w:r>
+      <w:r>
+        <w:rPr>
+          <w:b w:val="0"/>
+          <w:i w:val="0"/>
+          <w:color w:val="1A1A1A"/>
+          <w:sz w:val="17"/>
+        </w:rPr>
+        <w:t xml:space="preserve">The first live run reported success but had </w:t>
+      </w:r>
+      <w:r>
+        <w:rPr>
+          <w:b/>
+          <w:i w:val="0"/>
+          <w:color w:val="1A1A1A"/>
+          <w:sz w:val="17"/>
+        </w:rPr>
+        <w:t>silently skipped 7,553 rows</w:t>
+      </w:r>
+      <w:r>
+        <w:rPr>
+          <w:b w:val="0"/>
+          <w:i w:val="0"/>
+          <w:color w:val="1A1A1A"/>
+          <w:sz w:val="17"/>
+        </w:rPr>
+        <w:t xml:space="preserve">: GitHub's updated_at does not always follow its own sort order, and one out-of-place row made the cursor jump 18 months. Found it by comparing month-by-month counts with GitHub's own; after the fix a full sync holds </w:t>
+      </w:r>
+      <w:r>
+        <w:rPr>
+          <w:b/>
+          <w:i w:val="0"/>
+          <w:color w:val="1A1A1A"/>
+          <w:sz w:val="17"/>
+        </w:rPr>
+        <w:t>22,425 rows, exactly GitHub's count</w:t>
+      </w:r>
+      <w:r>
+        <w:rPr>
+          <w:b w:val="0"/>
+          <w:i w:val="0"/>
+          <w:color w:val="1A1A1A"/>
+          <w:sz w:val="17"/>
+        </w:rPr>
+        <w:t>, and a hard kill plus resume matches a clean run.</w:t>
+      </w:r>
+    </w:p>
+    <w:p>
+      <w:pPr>
+        <w:spacing w:before="80" w:after="10"/>
+      </w:pPr>
+      <w:r>
+        <w:rPr>
+          <w:b/>
+          <w:i w:val="0"/>
+          <w:color w:val="1A1A1A"/>
+          <w:sz w:val="18"/>
+        </w:rPr>
         <w:t>moneytrail: a bank-statement ledger that provably balances</w:t>
       </w:r>
       <w:r>
@@ -532,7 +846,7 @@
         </w:rPr>
         <w:t xml:space="preserve">    </w:t>
       </w:r>
-      <w:hyperlink r:id="rId12">
+      <w:hyperlink r:id="rId14">
         <w:r>
           <w:rPr>
             <w:color w:val="8a6d1a"/>
@@ -595,7 +909,7 @@
           <w:color w:val="1A1A1A"/>
           <w:sz w:val="17"/>
         </w:rPr>
-        <w:t xml:space="preserve"> rather than a categoriser: every parsed row is checked against arithmetic the bank already published, walking the running-balance column and confirming that opening plus credits minus debits equals closing. A dropped row surfaces as a line number and a rupee delta instead of a quietly wrong category total.</w:t>
+        <w:t xml:space="preserve"> rather than a categoriser: every parsed row is checked against arithmetic the bank already published, so a dropped row surfaces as a line number and a rupee delta instead of a quietly wrong total. Money is an integer count of paise throughout, with no floats in the codebase.</w:t>
       </w:r>
     </w:p>
     <w:p>
@@ -619,7 +933,7 @@
           <w:color w:val="1A1A1A"/>
           <w:sz w:val="17"/>
         </w:rPr>
-        <w:t>Stored money as an integer count of paise throughout, with no floats anywhere in the codebase, because binary floats cannot represent exact rupee amounts. Values are formatted as rupees only at the edge.</w:t>
+        <w:t>Parses CSV, spreadsheets and real bank PDFs, including password-protected files and borderless tables, and rejects scanned PDFs rather than guessing. Verified on a real bank export: 225 transactions across three months reconcile to the paisa, and first contact with real data surfaced four defects no synthetic fixture could have found. Each is now a test.</w:t>
       </w:r>
     </w:p>
     <w:p>
@@ -643,55 +957,7 @@
           <w:color w:val="1A1A1A"/>
           <w:sz w:val="17"/>
         </w:rPr>
-        <w:t>Parses CSV, TSV, spreadsheets and real bank PDFs, including password-protected files and borderless tables, where columns are recovered from where words sit under the header and wrapped narrations are stitched back together. Scanned PDFs are rejected rather than guessed at, and card statements reconcile against the issuer's summary box instead of a balance chain.</w:t>
-      </w:r>
-    </w:p>
-    <w:p>
-      <w:pPr>
-        <w:spacing w:before="0" w:after="30"/>
-        <w:ind w:left="245" w:hanging="158"/>
-      </w:pPr>
-      <w:r>
-        <w:rPr>
-          <w:b w:val="0"/>
-          <w:i w:val="0"/>
-          <w:color w:val="8A6D1A"/>
-          <w:sz w:val="17"/>
-        </w:rPr>
-        <w:t xml:space="preserve">•  </w:t>
-      </w:r>
-      <w:r>
-        <w:rPr>
-          <w:b w:val="0"/>
-          <w:i w:val="0"/>
-          <w:color w:val="1A1A1A"/>
-          <w:sz w:val="17"/>
-        </w:rPr>
-        <w:t>Verified against a real bank export, not only fixtures: 225 transactions across three months reconcile to the paisa, and against the closing balance the bank prints in its own summary block. First contact with real data surfaced four defects no synthetic fixture could have found, including amounts masked with asterisks and an IFSC code read as a reference number. Each is now a test.</w:t>
-      </w:r>
-    </w:p>
-    <w:p>
-      <w:pPr>
-        <w:spacing w:before="0" w:after="30"/>
-        <w:ind w:left="245" w:hanging="158"/>
-      </w:pPr>
-      <w:r>
-        <w:rPr>
-          <w:b w:val="0"/>
-          <w:i w:val="0"/>
-          <w:color w:val="8A6D1A"/>
-          <w:sz w:val="17"/>
-        </w:rPr>
-        <w:t xml:space="preserve">•  </w:t>
-      </w:r>
-      <w:r>
-        <w:rPr>
-          <w:b w:val="0"/>
-          <w:i w:val="0"/>
-          <w:color w:val="1A1A1A"/>
-          <w:sz w:val="17"/>
-        </w:rPr>
-        <w:t>499 tests, CI green on Python 3.11 and 3.12. Also shipped as a paid n8n template: extraction is deterministic, the model only assigns column roles behind a structured-output schema, and arithmetic checks the result. In a live run the model mislabelled a salary row and the row-by-row walk caught it, while an opening-versus-closing check alone would have passed it.</w:t>
+        <w:t>499 tests, CI green on Python 3.11 and 3.12. Also shipped as a paid n8n template where the model only assigns column roles and arithmetic checks every row; in a live run it caught a salary row the model had mislabelled.</w:t>
       </w:r>
     </w:p>
     <w:p>
@@ -716,7 +982,7 @@
         </w:rPr>
         <w:t xml:space="preserve">    </w:t>
       </w:r>
-      <w:hyperlink r:id="rId13">
+      <w:hyperlink r:id="rId15">
         <w:r>
           <w:rPr>
             <w:color w:val="8a6d1a"/>
@@ -858,7 +1124,7 @@
         </w:rPr>
         <w:t xml:space="preserve">    </w:t>
       </w:r>
-      <w:hyperlink r:id="rId14">
+      <w:hyperlink r:id="rId16">
         <w:r>
           <w:rPr>
             <w:color w:val="8a6d1a"/>
@@ -965,118 +1231,6 @@
           <w:color w:val="1A1A1A"/>
           <w:sz w:val="18"/>
         </w:rPr>
-        <w:t>bhavcopy-pipeline: a daily market-data pipeline</w:t>
-      </w:r>
-      <w:r>
-        <w:rPr>
-          <w:b w:val="0"/>
-          <w:i w:val="0"/>
-          <w:color w:val="444444"/>
-          <w:sz w:val="16"/>
-        </w:rPr>
-        <w:t xml:space="preserve">    </w:t>
-      </w:r>
-      <w:hyperlink r:id="rId15">
-        <w:r>
-          <w:rPr>
-            <w:color w:val="8a6d1a"/>
-            <w:sz w:val="17"/>
-          </w:rPr>
-          <w:t xml:space="preserve">github.com/veer0608/bhavcopy-pipeline</w:t>
-        </w:r>
-      </w:hyperlink>
-    </w:p>
-    <w:p>
-      <w:pPr>
-        <w:spacing w:before="0" w:after="30"/>
-      </w:pPr>
-      <w:r>
-        <w:rPr>
-          <w:b w:val="0"/>
-          <w:i/>
-          <w:color w:val="444444"/>
-          <w:sz w:val="16"/>
-        </w:rPr>
-        <w:t>Python · DuckDB · dbt · pytest · GitHub Actions</w:t>
-      </w:r>
-    </w:p>
-    <w:p>
-      <w:pPr>
-        <w:spacing w:before="0" w:after="30"/>
-        <w:ind w:left="245" w:hanging="158"/>
-      </w:pPr>
-      <w:r>
-        <w:rPr>
-          <w:b w:val="0"/>
-          <w:i w:val="0"/>
-          <w:color w:val="8A6D1A"/>
-          <w:sz w:val="17"/>
-        </w:rPr>
-        <w:t xml:space="preserve">•  </w:t>
-      </w:r>
-      <w:r>
-        <w:rPr>
-          <w:b w:val="0"/>
-          <w:i w:val="0"/>
-          <w:color w:val="1A1A1A"/>
-          <w:sz w:val="17"/>
-        </w:rPr>
-        <w:t>Built a daily pipeline for NSE and BSE end-of-day prices with no model in it: each file is landed as an immutable gzip, loaded into DuckDB, then modelled and tested with dbt, on a GitHub Actions schedule. 563,111 rows across 66 trading days per exchange.</w:t>
-      </w:r>
-    </w:p>
-    <w:p>
-      <w:pPr>
-        <w:spacing w:before="0" w:after="30"/>
-        <w:ind w:left="245" w:hanging="158"/>
-      </w:pPr>
-      <w:r>
-        <w:rPr>
-          <w:b w:val="0"/>
-          <w:i w:val="0"/>
-          <w:color w:val="8A6D1A"/>
-          <w:sz w:val="17"/>
-        </w:rPr>
-        <w:t xml:space="preserve">•  </w:t>
-      </w:r>
-      <w:r>
-        <w:rPr>
-          <w:b w:val="0"/>
-          <w:i w:val="0"/>
-          <w:color w:val="1A1A1A"/>
-          <w:sz w:val="17"/>
-        </w:rPr>
-        <w:t xml:space="preserve">Made the load </w:t>
-      </w:r>
-      <w:r>
-        <w:rPr>
-          <w:b/>
-          <w:i w:val="0"/>
-          <w:color w:val="1A1A1A"/>
-          <w:sz w:val="17"/>
-        </w:rPr>
-        <w:t>idempotent and restatable</w:t>
-      </w:r>
-      <w:r>
-        <w:rPr>
-          <w:b w:val="0"/>
-          <w:i w:val="0"/>
-          <w:color w:val="1A1A1A"/>
-          <w:sz w:val="17"/>
-        </w:rPr>
-        <w:t>, and tested both: re-running a day changes nothing, an incremental build equals a full refresh, and a republished file replaces its day whole. 18 dbt data tests.</w:t>
-      </w:r>
-    </w:p>
-    <w:p>
-      <w:pPr>
-        <w:spacing w:before="80" w:after="10"/>
-      </w:pPr>
-      <w:r>
-        <w:rPr>
-          <w:b/>
-          <w:i w:val="0"/>
-          <w:color w:val="1A1A1A"/>
-          <w:sz w:val="18"/>
-        </w:rPr>
         <w:t>schemablind: a schema-blind SQL agent</w:t>
       </w:r>
       <w:r>
@@ -1088,7 +1242,7 @@
         </w:rPr>
         <w:t xml:space="preserve">    </w:t>
       </w:r>
-      <w:hyperlink r:id="rId16">
+      <w:hyperlink r:id="rId17">
         <w:r>
           <w:rPr>
             <w:color w:val="8a6d1a"/>
@@ -1157,7 +1311,7 @@
           <w:color w:val="1A1A1A"/>
           <w:sz w:val="17"/>
         </w:rPr>
-        <w:t>Scored on BIRD execution accuracy: the agent's rows against the reference query's rows on the same database, with no judge model deciding whether the SQL looks right. 40% of questions are held back as a test split assigned by hash of the question text, so a prompt tuned on failures cannot choose what it is marked on.</w:t>
+        <w:t>Scored on BIRD execution accuracy: the agent's rows against the reference query's rows on the same database, with no judge model deciding whether the SQL looks right. 40% of questions are held back as a test split assigned by hash of the question text, so a prompt tuned on failures cannot choose what it is marked on. First full run: 64.7% on the 266-question dev half with Gemini 3.5 Flash-Lite, about half a cent per question; the held-out half is not yet scored.</w:t>
       </w:r>
     </w:p>
     <w:p>
@@ -1206,7 +1360,7 @@
         </w:rPr>
         <w:t xml:space="preserve">    </w:t>
       </w:r>
-      <w:hyperlink r:id="rId17">
+      <w:hyperlink r:id="rId18">
         <w:r>
           <w:rPr>
             <w:color w:val="8a6d1a"/>
@@ -1276,154 +1430,6 @@
           <w:sz w:val="17"/>
         </w:rPr>
         <w:t>Caption and cut timings come from the TTS engine's own word-boundary events rather than from transcribing the audio it had just produced, so there is no Whisper dependency and nothing to drift. Shots cut on the sentence boundaries those same events report, and candidate stock clips are re-ranked by a vision model against the narration line, because stock search ranks by popularity rather than by what is in frame.</w:t>
-      </w:r>
-    </w:p>
-    <w:p>
-      <w:pPr>
-        <w:spacing w:before="80" w:after="10"/>
-      </w:pPr>
-      <w:r>
-        <w:rPr>
-          <w:b/>
-          <w:i w:val="0"/>
-          <w:color w:val="1A1A1A"/>
-          <w:sz w:val="18"/>
-        </w:rPr>
-        <w:t>AgencyDesk: a multi-tenant SaaS platform</w:t>
-      </w:r>
-      <w:r>
-        <w:rPr>
-          <w:b w:val="0"/>
-          <w:i w:val="0"/>
-          <w:color w:val="444444"/>
-          <w:sz w:val="16"/>
-        </w:rPr>
-        <w:t xml:space="preserve">    </w:t>
-      </w:r>
-      <w:hyperlink r:id="rId18">
-        <w:r>
-          <w:rPr>
-            <w:color w:val="8a6d1a"/>
-            <w:sz w:val="17"/>
-          </w:rPr>
-          <w:t xml:space="preserve">github.com/veer0608/agencydesk</w:t>
-        </w:r>
-      </w:hyperlink>
-    </w:p>
-    <w:p>
-      <w:pPr>
-        <w:spacing w:before="0" w:after="30"/>
-      </w:pPr>
-      <w:r>
-        <w:rPr>
-          <w:b w:val="0"/>
-          <w:i/>
-          <w:color w:val="444444"/>
-          <w:sz w:val="16"/>
-        </w:rPr>
-        <w:t>React · FastAPI · PostgreSQL · Docker</w:t>
-      </w:r>
-    </w:p>
-    <w:p>
-      <w:pPr>
-        <w:spacing w:before="0" w:after="30"/>
-        <w:ind w:left="245" w:hanging="158"/>
-      </w:pPr>
-      <w:r>
-        <w:rPr>
-          <w:b w:val="0"/>
-          <w:i w:val="0"/>
-          <w:color w:val="8A6D1A"/>
-          <w:sz w:val="17"/>
-        </w:rPr>
-        <w:t xml:space="preserve">•  </w:t>
-      </w:r>
-      <w:r>
-        <w:rPr>
-          <w:b w:val="0"/>
-          <w:i w:val="0"/>
-          <w:color w:val="1A1A1A"/>
-          <w:sz w:val="17"/>
-        </w:rPr>
-        <w:t>Built a multi-tenant client and project management platform where one deployment serves many isolated agencies, each with its own clients, projects and client portal.</w:t>
-      </w:r>
-    </w:p>
-    <w:p>
-      <w:pPr>
-        <w:spacing w:before="0" w:after="30"/>
-        <w:ind w:left="245" w:hanging="158"/>
-      </w:pPr>
-      <w:r>
-        <w:rPr>
-          <w:b w:val="0"/>
-          <w:i w:val="0"/>
-          <w:color w:val="8A6D1A"/>
-          <w:sz w:val="17"/>
-        </w:rPr>
-        <w:t xml:space="preserve">•  </w:t>
-      </w:r>
-      <w:r>
-        <w:rPr>
-          <w:b w:val="0"/>
-          <w:i w:val="0"/>
-          <w:color w:val="1A1A1A"/>
-          <w:sz w:val="17"/>
-        </w:rPr>
-        <w:t>Enforced tenant isolation and internal-versus-client visibility with PostgreSQL row-level security and composite foreign keys, so cross-tenant access is impossible even if application code is wrong, and the API connects as an unprivileged database role. 70 automated tests cover cross-tenant isolation and role-based visibility. Containerized with Docker Compose, with GitHub Actions CI on every push.</w:t>
-      </w:r>
-    </w:p>
-    <w:p>
-      <w:pPr>
-        <w:spacing w:before="140" w:after="60"/>
-        <w:pBdr>
-          <w:bottom w:val="single" w:sz="6" w:space="1" w:color="8a6d1a"/>
-        </w:pBdr>
-      </w:pPr>
-      <w:r>
-        <w:rPr>
-          <w:b/>
-          <w:i w:val="0"/>
-          <w:color w:val="8A6D1A"/>
-          <w:sz w:val="20"/>
-        </w:rPr>
-        <w:t>EDUCATION</w:t>
-      </w:r>
-    </w:p>
-    <w:p>
-      <w:pPr>
-        <w:spacing w:before="0" w:after="30"/>
-      </w:pPr>
-      <w:r>
-        <w:rPr>
-          <w:b/>
-          <w:i w:val="0"/>
-          <w:color w:val="1A1A1A"/>
-          <w:sz w:val="17"/>
-        </w:rPr>
-        <w:t>Madhav Institute of Technology &amp; Science, Gwalior</w:t>
-      </w:r>
-      <w:r>
-        <w:rPr>
-          <w:b w:val="0"/>
-          <w:i w:val="0"/>
-          <w:color w:val="1A1A1A"/>
-          <w:sz w:val="17"/>
-        </w:rPr>
-        <w:t>, B.Tech, Computer Science &amp; Design, 2022 – 2026</w:t>
-      </w:r>
-    </w:p>
-    <w:p>
-      <w:pPr>
-        <w:spacing w:before="0" w:after="40"/>
-      </w:pPr>
-      <w:r>
-        <w:rPr>
-          <w:b w:val="0"/>
-          <w:i w:val="0"/>
-          <w:color w:val="444444"/>
-          <w:sz w:val="16"/>
-        </w:rPr>
-        <w:t>Shanti Niketan HS School, Vidisha, Class 12 (2021)   •   Trinity Convent Sr. Sec. School, Vidisha, Class 10 (2019)</w:t>
       </w:r>
     </w:p>
     <w:p>
@@ -1538,7 +1544,7 @@
             <w:sz w:val="17"/>
             <w:b/>
           </w:rPr>
-          <w:t xml:space="preserve">travel-admin-organizer</w:t>
+          <w:t xml:space="preserve">AgencyDesk</w:t>
         </w:r>
       </w:hyperlink>
       <w:r>
@@ -1548,7 +1554,7 @@
           <w:color w:val="1A1A1A"/>
           <w:sz w:val="16"/>
         </w:rPr>
-        <w:t>, an Activepieces agent that turns Gmail booking confirmations into one itinerary, buffered calendar events and an expense sheet per trip.</w:t>
+        <w:t>, multi-tenant SaaS where tenant isolation is enforced by PostgreSQL row-level security rather than by application code. 70 tests prove cross-tenant access is impossible.</w:t>
       </w:r>
     </w:p>
     <w:p>

</xml_diff>

<commit_message>
Lead with data work: hero and about, data projects first, test counts recounted
</commit_message>
<xml_diff>
--- a/Veer_Arora_Resume.docx
+++ b/Veer_Arora_Resume.docx
@@ -957,7 +957,7 @@
           <w:color w:val="1A1A1A"/>
           <w:sz w:val="17"/>
         </w:rPr>
-        <w:t>499 tests, CI green on Python 3.11 and 3.12. Also shipped as a paid n8n template where the model only assigns column roles and arithmetic checks every row; in a live run it caught a salary row the model had mislabelled.</w:t>
+        <w:t>529 tests, CI green on Python 3.11 and 3.12. Also shipped as a paid n8n template where the model only assigns column roles and arithmetic checks every row; in a live run it caught a salary row the model had mislabelled.</w:t>
       </w:r>
     </w:p>
     <w:p>
@@ -1075,7 +1075,7 @@
           <w:color w:val="1A1A1A"/>
           <w:sz w:val="17"/>
         </w:rPr>
-        <w:t>Wrote a scenario-based evaluation harness scoring six dimensions (tool-selection precision, recall and F1, task-success, escalation accuracy, citation-grounding, cost, latency) and persisted every run for before-and-after tracking. FastAPI, SQLAlchemy and Alembic on SQLite in development and Postgres in production; 36 automated tests.</w:t>
+        <w:t>Wrote a scenario-based evaluation harness scoring six dimensions (tool-selection precision, recall and F1, task-success, escalation accuracy, citation-grounding, cost, latency) and persisted every run for before-and-after tracking. FastAPI, SQLAlchemy and Alembic on SQLite in development and Postgres in production; 38 automated tests.</w:t>
       </w:r>
     </w:p>
     <w:p>
@@ -1217,7 +1217,7 @@
           <w:color w:val="1A1A1A"/>
           <w:sz w:val="17"/>
         </w:rPr>
-        <w:t>Local embeddings and re-ranker on SQLite-vec, so the retrieval path and the whole eval harness run without a paid API. 77 tests, CI on every push.</w:t>
+        <w:t>Local embeddings and re-ranker on SQLite-vec, so the retrieval path and the whole eval harness run without a paid API. 80 tests, CI on every push.</w:t>
       </w:r>
     </w:p>
     <w:p>
@@ -1335,7 +1335,7 @@
           <w:color w:val="1A1A1A"/>
           <w:sz w:val="17"/>
         </w:rPr>
-        <w:t>Tested the harness before trusting it: an oracle solver must score 100% and a mute solver 0%, asserted in CI on every push. Model-composed SQL runs behind four independent sandbox layers, and CI asserts the database is byte-identical after attempted writes. A run that exhausts its token budget is reported as unscored rather than as a partial number. 119 tests.</w:t>
+        <w:t>Tested the harness before trusting it: an oracle solver must score 100% and a mute solver 0%, asserted in CI on every push. Model-composed SQL runs behind four independent sandbox layers, and CI asserts the database is byte-identical after attempted writes. A run that exhausts its token budget is reported as unscored rather than as a partial number. 203 tests.</w:t>
       </w:r>
     </w:p>
     <w:p>

</xml_diff>

<commit_message>
Resume: current build of the general variant
CiteRAG's recall figures now stay with their own question sets (0.37 to
0.73 on 30, 0.77 against a 0.85 ceiling on 60). Also carries the
bhavcopy-pipeline updates made since the last upload: split and bonus
adjustment, the security dimension, and 33 dbt data tests.
</commit_message>
<xml_diff>
--- a/Veer_Arora_Resume.docx
+++ b/Veer_Arora_Resume.docx
@@ -129,7 +129,7 @@
           <w:color w:val="1A1A1A"/>
           <w:sz w:val="17"/>
         </w:rPr>
-        <w:t>Data and backend engineer, B.Tech Computer Science &amp; Design (2026), who builds systems that check their own output. Built a daily NSE and BSE price pipeline on DuckDB, dbt and GitHub Actions whose loads are idempotent and restatable, an API connector that resumes safely after a crash, a bank-statement ledger that proves it balances to the paisa before it categorises anything, and a RAG system whose recall@5 rose from 0.37 to 0.77 against a measured ceiling of 0.85. At L&amp;T Finance, validated Nostradamus, an 8-model MLOps platform on GCP and Kubeflow, ahead of its production release.</w:t>
+        <w:t>Data and backend engineer, B.Tech Computer Science &amp; Design (2026), who builds systems that check their own output. Built a daily NSE and BSE price pipeline on DuckDB, dbt and GitHub Actions whose loads are idempotent and restatable, an API connector that resumes safely after a crash, a bank-statement ledger that proves it balances to the paisa before it categorises anything, and a RAG system at recall@5 0.77 against a measured ceiling of 0.85 on 60 questions. At L&amp;T Finance, validated Nostradamus, an 8-model MLOps platform on GCP and Kubeflow, ahead of its production release.</w:t>
       </w:r>
     </w:p>
     <w:p>
@@ -223,7 +223,7 @@
           <w:color w:val="1A1A1A"/>
           <w:sz w:val="17"/>
         </w:rPr>
-        <w:t>Python, SQL, DuckDB, dbt, Dagster, Pandas, NumPy, data cleaning and validation, EDA</w:t>
+        <w:t>Python, SQL including recursive CTEs, DuckDB, dbt, SCD type 2 dimensions, Dagster, Pandas, NumPy, data cleaning and validation, EDA</w:t>
       </w:r>
     </w:p>
     <w:p>
@@ -673,7 +673,67 @@
           <w:color w:val="1A1A1A"/>
           <w:sz w:val="17"/>
         </w:rPr>
-        <w:t>, and tested both: re-running a day changes nothing, an incremental build equals a full refresh, and a republished file replaces its day whole. 18 dbt data tests.</w:t>
+        <w:t>, and tested both: re-running a day changes nothing, an incremental build equals a full refresh, and a republished file replaces its day whole. 33 dbt data tests.</w:t>
+      </w:r>
+    </w:p>
+    <w:p>
+      <w:pPr>
+        <w:spacing w:before="0" w:after="30"/>
+        <w:ind w:left="245" w:hanging="158"/>
+      </w:pPr>
+      <w:r>
+        <w:rPr>
+          <w:b w:val="0"/>
+          <w:i w:val="0"/>
+          <w:color w:val="8A6D1A"/>
+          <w:sz w:val="17"/>
+        </w:rPr>
+        <w:t xml:space="preserve">•  </w:t>
+      </w:r>
+      <w:r>
+        <w:rPr>
+          <w:b w:val="0"/>
+          <w:i w:val="0"/>
+          <w:color w:val="1A1A1A"/>
+          <w:sz w:val="17"/>
+        </w:rPr>
+        <w:t xml:space="preserve">Found that the dashboard's top losers often listed stocks that had not fallen: on a split or bonus day the exchange file reports the previous close in old shares, so a 2:1 bonus read </w:t>
+      </w:r>
+      <w:r>
+        <w:rPr>
+          <w:b/>
+          <w:i w:val="0"/>
+          <w:color w:val="1A1A1A"/>
+          <w:sz w:val="17"/>
+        </w:rPr>
+        <w:t>-65.90%</w:t>
+      </w:r>
+      <w:r>
+        <w:rPr>
+          <w:b w:val="0"/>
+          <w:i w:val="0"/>
+          <w:color w:val="1A1A1A"/>
+          <w:sz w:val="17"/>
+        </w:rPr>
+        <w:t xml:space="preserve">. Added NSE corporate actions and a split-adjusted daily change in dbt; split stocks in the top-10 losers went from </w:t>
+      </w:r>
+      <w:r>
+        <w:rPr>
+          <w:b/>
+          <w:i w:val="0"/>
+          <w:color w:val="1A1A1A"/>
+          <w:sz w:val="17"/>
+        </w:rPr>
+        <w:t>30 of 144 exchange-days to 1</w:t>
+      </w:r>
+      <w:r>
+        <w:rPr>
+          <w:b w:val="0"/>
+          <w:i w:val="0"/>
+          <w:color w:val="1A1A1A"/>
+          <w:sz w:val="17"/>
+        </w:rPr>
+        <w:t>, a genuine fall. A uniqueness test caught duplicated rows from the BSE-to-NSE ISIN match before it shipped.</w:t>
       </w:r>
     </w:p>
     <w:p>
@@ -1193,7 +1253,7 @@
           <w:color w:val="1A1A1A"/>
           <w:sz w:val="17"/>
         </w:rPr>
-        <w:t>Created a golden-set eval harness (recall@k, MRR) and raised recall@5 from 0.37 to 0.77 against a measured ceiling of 0.85, by reworking the chunking strategy and adding a cross-encoder re-ranker. The largest single gain came from fixing PDF text extraction, not from retrieval design.</w:t>
+        <w:t>Created a golden-set eval harness (recall@k, MRR). On 30 questions, chunking, a cross-encoder re-ranker and hybrid keyword search raised recall@5 from 0.37 to 0.73; on a harder 60 it reaches 0.77 against a measured ceiling of 0.85. On the 60, the largest gain came from fixing PDF text extraction.</w:t>
       </w:r>
     </w:p>
     <w:p>

</xml_diff>